<commit_message>
Update repository references to JPT
</commit_message>
<xml_diff>
--- a/docs/competition/监盘通-可复现材料.docx
+++ b/docs/competition/监盘通-可复现材料.docx
@@ -23,7 +23,7 @@
         <w:pStyle w:val="ListBullet"/>
       </w:pPr>
       <w:r>
-        <w:t>源码仓库：&lt;https://github.com/tentyou/Tenken&gt;</w:t>
+        <w:t>源码仓库：&lt;https://github.com/tentyou/JPT&gt;</w:t>
       </w:r>
     </w:p>
     <w:p>
@@ -31,7 +31,7 @@
         <w:pStyle w:val="ListBullet"/>
       </w:pPr>
       <w:r>
-        <w:t>最新安装包：&lt;https://github.com/tentyou/Tenken/releases/latest&gt;</w:t>
+        <w:t>最新安装包：&lt;https://github.com/tentyou/JPT/releases/latest&gt;</w:t>
       </w:r>
     </w:p>
     <w:p>
@@ -92,12 +92,12 @@
     </w:p>
     <w:p>
       <w:r>
-        <w:t>git clone https://github.com/tentyou/Tenken.git</w:t>
+        <w:t>git clone https://github.com/tentyou/JPT.git</w:t>
       </w:r>
     </w:p>
     <w:p>
       <w:r>
-        <w:t>cd Tenken</w:t>
+        <w:t>cd JPT</w:t>
       </w:r>
     </w:p>
     <w:p>

</xml_diff>